<commit_message>
Update Redis Discovery User Guide with import/export features and branding
Documents the two newest capabilities: Credential Scan's .ini file input
(alongside the existing CSV) and the Results page's client-side "INI with
credentials" export. Also adds a "What's new" section, a fuller CSV export
field list, and a credential-iteration workflow. Recolors headings and
table header rows to Redis brand red.

Co-Authored-By: Claude Sonnet 5 <noreply@anthropic.com>
</commit_message>
<xml_diff>
--- a/Redis_Discovery_User_Guide.docx
+++ b/Redis_Discovery_User_Guide.docx
@@ -79,6 +79,97 @@
         </w:pict>
       </w:r>
     </w:p>
+    <w:p>
+      <w:pPr>
+        <w:pStyle w:val="Heading2"/>
+      </w:pPr>
+      <w:r>
+        <w:t xml:space="preserve">What’s new</w:t>
+      </w:r>
+    </w:p>
+    <w:p>
+      <w:pPr>
+        <w:pStyle w:val="Compact"/>
+      </w:pPr>
+      <w:r>
+        <w:t xml:space="preserve">This section calls out the newest capabilities. The rest of the guide below covers everything else in full detail.</w:t>
+      </w:r>
+    </w:p>
+    <w:p>
+      <w:pPr>
+        <w:pStyle w:val="Compact"/>
+        <w:numPr>
+          <w:ilvl w:val="0"/>
+          <w:numId w:val="1005"/>
+        </w:numPr>
+      </w:pPr>
+      <w:r>
+        <w:t xml:space="preserve">Credential Scan now accepts an </w:t>
+      </w:r>
+      <w:r>
+        <w:rPr>
+          <w:rStyle w:val="VerbatimChar"/>
+        </w:rPr>
+        <w:t xml:space="preserve">.ini</w:t>
+      </w:r>
+      <w:r>
+        <w:t xml:space="preserve"> file, not just CSV — see </w:t>
+      </w:r>
+      <w:r>
+        <w:rPr>
+          <w:rStyle w:val="VerbatimChar"/>
+        </w:rPr>
+        <w:t xml:space="preserve">rscan credential-scan</w:t>
+      </w:r>
+      <w:r>
+        <w:t xml:space="preserve"> and the Credential Scan page.</w:t>
+      </w:r>
+    </w:p>
+    <w:p>
+      <w:pPr>
+        <w:pStyle w:val="Compact"/>
+        <w:numPr>
+          <w:ilvl w:val="0"/>
+          <w:numId w:val="1005"/>
+        </w:numPr>
+      </w:pPr>
+      <w:r>
+        <w:t xml:space="preserve">The Results page has a new </w:t>
+      </w:r>
+      <w:r>
+        <w:rPr>
+          <w:rStyle w:val="VerbatimChar"/>
+        </w:rPr>
+        <w:t xml:space="preserve">INI with credentials</w:t>
+      </w:r>
+      <w:r>
+        <w:t xml:space="preserve"> button for re-attaching credentials to an export without retyping them — see Exports.</w:t>
+      </w:r>
+    </w:p>
+    <w:p>
+      <w:pPr>
+        <w:pStyle w:val="Compact"/>
+        <w:numPr>
+          <w:ilvl w:val="0"/>
+          <w:numId w:val="1005"/>
+        </w:numPr>
+      </w:pPr>
+      <w:r>
+        <w:t xml:space="preserve">CSV export is now a complete dump of every field the JSON API returns, not just what the results table shows — see Exports.</w:t>
+      </w:r>
+    </w:p>
+    <w:p>
+      <w:pPr>
+        <w:pStyle w:val="Compact"/>
+        <w:numPr>
+          <w:ilvl w:val="0"/>
+          <w:numId w:val="1005"/>
+        </w:numPr>
+      </w:pPr>
+      <w:r>
+        <w:t xml:space="preserve">The results table’s Memory column shows used memory versus the configured maximum, not just used memory.</w:t>
+      </w:r>
+    </w:p>
     <w:bookmarkStart w:id="20" w:name="what-redis-discovery-does"/>
     <w:p>
       <w:pPr>
@@ -3981,7 +4072,16 @@
               <w:t xml:space="preserve">host,port,username,password</w:t>
             </w:r>
             <w:r>
-              <w:t xml:space="preserve">. A header row is allowed and skipped automatically.</w:t>
+              <w:t xml:space="preserve"> (a header row is allowed and skipped automatically), or an </w:t>
+            </w:r>
+            <w:r>
+              <w:rPr>
+                <w:rStyle w:val="VerbatimChar"/>
+              </w:rPr>
+              <w:t xml:space="preserve">.ini</w:t>
+            </w:r>
+            <w:r>
+              <w:t xml:space="preserve"> file in the same format Export INI produces. The format is chosen automatically from the file extension.</w:t>
             </w:r>
           </w:p>
         </w:tc>
@@ -4414,6 +4514,228 @@
       </w:r>
     </w:p>
     <w:bookmarkEnd w:id="61"/>
+    <w:p>
+      <w:pPr>
+        <w:pStyle w:val="Heading3"/>
+      </w:pPr>
+      <w:r>
+        <w:t xml:space="preserve">INI input format</w:t>
+      </w:r>
+    </w:p>
+    <w:p>
+      <w:pPr>
+        <w:pStyle w:val="Compact"/>
+      </w:pPr>
+      <w:r>
+        <w:t xml:space="preserve">You can also point </w:t>
+      </w:r>
+      <w:r>
+        <w:rPr>
+          <w:rStyle w:val="VerbatimChar"/>
+        </w:rPr>
+        <w:t xml:space="preserve">-f</w:t>
+      </w:r>
+      <w:r>
+        <w:t xml:space="preserve"> at an </w:t>
+      </w:r>
+      <w:r>
+        <w:rPr>
+          <w:rStyle w:val="VerbatimChar"/>
+        </w:rPr>
+        <w:t xml:space="preserve">.ini</w:t>
+      </w:r>
+      <w:r>
+        <w:t xml:space="preserve"> file, in the exact format Export INI (see Exports) produces. This is meant for a round trip: run a scan, use Export INI to get a skeleton with </w:t>
+      </w:r>
+      <w:r>
+        <w:rPr>
+          <w:rStyle w:val="VerbatimChar"/>
+        </w:rPr>
+        <w:t xml:space="preserve">host</w:t>
+      </w:r>
+      <w:r>
+        <w:t xml:space="preserve">, </w:t>
+      </w:r>
+      <w:r>
+        <w:rPr>
+          <w:rStyle w:val="VerbatimChar"/>
+        </w:rPr>
+        <w:t xml:space="preserve">port</w:t>
+      </w:r>
+      <w:r>
+        <w:t xml:space="preserve">, and </w:t>
+      </w:r>
+      <w:r>
+        <w:rPr>
+          <w:rStyle w:val="VerbatimChar"/>
+        </w:rPr>
+        <w:t xml:space="preserve">tls</w:t>
+      </w:r>
+      <w:r>
+        <w:t xml:space="preserve"> already filled in, add </w:t>
+      </w:r>
+      <w:r>
+        <w:rPr>
+          <w:rStyle w:val="VerbatimChar"/>
+        </w:rPr>
+        <w:t xml:space="preserve">username</w:t>
+      </w:r>
+      <w:r>
+        <w:t xml:space="preserve"> and </w:t>
+      </w:r>
+      <w:r>
+        <w:rPr>
+          <w:rStyle w:val="VerbatimChar"/>
+        </w:rPr>
+        <w:t xml:space="preserve">password</w:t>
+      </w:r>
+      <w:r>
+        <w:t xml:space="preserve"> for the hosts you have credentials for, then feed that same file back in here.</w:t>
+      </w:r>
+    </w:p>
+    <w:p>
+      <w:pPr>
+        <w:pStyle w:val="Compact"/>
+      </w:pPr>
+      <w:r>
+        <w:t xml:space="preserve">Redis Discovery picks CSV or INI parsing based on the file's extension — name the file .ini to use this format.</w:t>
+      </w:r>
+    </w:p>
+    <w:p>
+      <w:pPr>
+        <w:pStyle w:val="Compact"/>
+        <w:numPr>
+          <w:ilvl w:val="0"/>
+          <w:numId w:val="1005"/>
+        </w:numPr>
+      </w:pPr>
+      <w:r>
+        <w:t xml:space="preserve">One </w:t>
+      </w:r>
+      <w:r>
+        <w:rPr>
+          <w:rStyle w:val="VerbatimChar"/>
+        </w:rPr>
+        <w:t xml:space="preserve">[host:port]</w:t>
+      </w:r>
+      <w:r>
+        <w:t xml:space="preserve"> section per target. The section header itself is not parsed — only the </w:t>
+      </w:r>
+      <w:r>
+        <w:rPr>
+          <w:rStyle w:val="VerbatimChar"/>
+        </w:rPr>
+        <w:t xml:space="preserve">host =</w:t>
+      </w:r>
+      <w:r>
+        <w:t xml:space="preserve"> and </w:t>
+      </w:r>
+      <w:r>
+        <w:rPr>
+          <w:rStyle w:val="VerbatimChar"/>
+        </w:rPr>
+        <w:t xml:space="preserve">port =</w:t>
+      </w:r>
+      <w:r>
+        <w:t xml:space="preserve"> lines inside it are.</w:t>
+      </w:r>
+    </w:p>
+    <w:p>
+      <w:pPr>
+        <w:pStyle w:val="Compact"/>
+        <w:numPr>
+          <w:ilvl w:val="0"/>
+          <w:numId w:val="1005"/>
+        </w:numPr>
+      </w:pPr>
+      <w:r>
+        <w:rPr>
+          <w:rStyle w:val="VerbatimChar"/>
+        </w:rPr>
+        <w:t xml:space="preserve">username</w:t>
+      </w:r>
+      <w:r>
+        <w:t xml:space="preserve"> and </w:t>
+      </w:r>
+      <w:r>
+        <w:rPr>
+          <w:rStyle w:val="VerbatimChar"/>
+        </w:rPr>
+        <w:t xml:space="preserve">password</w:t>
+      </w:r>
+      <w:r>
+        <w:t xml:space="preserve"> may be blank, same meaning as a blank CSV field.</w:t>
+      </w:r>
+    </w:p>
+    <w:p>
+      <w:pPr>
+        <w:pStyle w:val="Compact"/>
+        <w:numPr>
+          <w:ilvl w:val="0"/>
+          <w:numId w:val="1005"/>
+        </w:numPr>
+      </w:pPr>
+      <w:r>
+        <w:t xml:space="preserve">Lines starting with </w:t>
+      </w:r>
+      <w:r>
+        <w:rPr>
+          <w:rStyle w:val="VerbatimChar"/>
+        </w:rPr>
+        <w:t xml:space="preserve">;</w:t>
+      </w:r>
+      <w:r>
+        <w:t xml:space="preserve"> or </w:t>
+      </w:r>
+      <w:r>
+        <w:rPr>
+          <w:rStyle w:val="VerbatimChar"/>
+        </w:rPr>
+        <w:t xml:space="preserve">#</w:t>
+      </w:r>
+      <w:r>
+        <w:t xml:space="preserve"> are comments and are ignored, including the commented-out </w:t>
+      </w:r>
+      <w:r>
+        <w:rPr>
+          <w:rStyle w:val="VerbatimChar"/>
+        </w:rPr>
+        <w:t xml:space="preserve">ca_cert</w:t>
+      </w:r>
+      <w:r>
+        <w:t xml:space="preserve">/</w:t>
+      </w:r>
+      <w:r>
+        <w:rPr>
+          <w:rStyle w:val="VerbatimChar"/>
+        </w:rPr>
+        <w:t xml:space="preserve">client_cert</w:t>
+      </w:r>
+      <w:r>
+        <w:t xml:space="preserve">/</w:t>
+      </w:r>
+      <w:r>
+        <w:rPr>
+          <w:rStyle w:val="VerbatimChar"/>
+        </w:rPr>
+        <w:t xml:space="preserve">client_key</w:t>
+      </w:r>
+      <w:r>
+        <w:t xml:space="preserve"> placeholders Export INI writes — this tool has no mTLS support.</w:t>
+      </w:r>
+    </w:p>
+    <w:p>
+      <w:pPr>
+        <w:pStyle w:val="Compact"/>
+        <w:numPr>
+          <w:ilvl w:val="0"/>
+          <w:numId w:val="1005"/>
+        </w:numPr>
+      </w:pPr>
+      <w:r>
+        <w:t xml:space="preserve">Malformed sections are skipped with warnings on stderr, same as a malformed CSV row.</w:t>
+      </w:r>
+    </w:p>
     <w:bookmarkStart w:id="66" w:name="credential-scan-examples"/>
     <w:p>
       <w:pPr>
@@ -6446,7 +6768,7 @@
         <w:pStyle w:val="Heading3"/>
       </w:pPr>
       <w:r>
-        <w:t xml:space="preserve">CSV upload</w:t>
+        <w:t xml:space="preserve">CSV or INI upload</w:t>
       </w:r>
     </w:p>
     <w:p>
@@ -6597,6 +6919,41 @@
       </w:pPr>
       <w:r>
         <w:t xml:space="preserve">Each row’s credentials are used only for that row’s connection attempt.</w:t>
+      </w:r>
+    </w:p>
+    <w:p>
+      <w:pPr>
+        <w:pStyle w:val="Compact"/>
+      </w:pPr>
+      <w:r>
+        <w:t xml:space="preserve">You can also upload an </w:t>
+      </w:r>
+      <w:r>
+        <w:rPr>
+          <w:rStyle w:val="VerbatimChar"/>
+        </w:rPr>
+        <w:t xml:space="preserve">.ini</w:t>
+      </w:r>
+      <w:r>
+        <w:t xml:space="preserve"> file here — the same format Export INI produces on the Results page. This is meant for iterating on credentials: run a scan, Export INI, fill in </w:t>
+      </w:r>
+      <w:r>
+        <w:rPr>
+          <w:rStyle w:val="VerbatimChar"/>
+        </w:rPr>
+        <w:t xml:space="preserve">username</w:t>
+      </w:r>
+      <w:r>
+        <w:t xml:space="preserve">/</w:t>
+      </w:r>
+      <w:r>
+        <w:rPr>
+          <w:rStyle w:val="VerbatimChar"/>
+        </w:rPr>
+        <w:t xml:space="preserve">password</w:t>
+      </w:r>
+      <w:r>
+        <w:t xml:space="preserve"> for the hosts you have credentials for in a text editor, then upload that file here. The format is chosen automatically from the file extension.</w:t>
       </w:r>
     </w:p>
     <w:bookmarkEnd w:id="86"/>
@@ -8084,7 +8441,7 @@
         <w:pStyle w:val="BodyText"/>
       </w:pPr>
       <w:r>
-        <w:t xml:space="preserve">CSV includes more fields than the visible table, including deeper inventory structures such as memory, clients, keyspace, modules, cluster info, replicas, and certificate details.</w:t>
+        <w:t xml:space="preserve">CSV is a complete dump of every field the JSON API returns, not just what the table shows. Beyond the visible columns, this includes: whether authentication was required; connected client count; max memory, peak used memory, and total system memory; full per-replica detail (not just a count); full per-database keyspace detail (not just a total key count); full per-module detail including version and path (not just names); full cluster info (enabled, slots assigned, known nodes, size — not just state); and the certificate’s validFrom date and SHA-256 fingerprint.</w:t>
       </w:r>
     </w:p>
     <w:bookmarkEnd w:id="105"/>
@@ -8231,6 +8588,85 @@
       </w:r>
       <w:r>
         <w:t xml:space="preserve">are left blank because Redis Discovery does not retain credentials.</w:t>
+      </w:r>
+    </w:p>
+    <w:p>
+      <w:pPr>
+        <w:pStyle w:val="Heading3"/>
+      </w:pPr>
+      <w:r>
+        <w:t xml:space="preserve">INI with credentials</w:t>
+      </w:r>
+    </w:p>
+    <w:p>
+      <w:pPr>
+        <w:pStyle w:val="Compact"/>
+      </w:pPr>
+      <w:r>
+        <w:t xml:space="preserve">A second button next to Export INI, for when you want the credentials back in the file. Clicking it warns that the resulting file will contain plaintext credentials, then lets you pick a CSV or </w:t>
+      </w:r>
+      <w:r>
+        <w:rPr>
+          <w:rStyle w:val="VerbatimChar"/>
+        </w:rPr>
+        <w:t xml:space="preserve">.ini</w:t>
+      </w:r>
+      <w:r>
+        <w:t xml:space="preserve"> file — typically one you already filled in from an earlier Export INI. Its </w:t>
+      </w:r>
+      <w:r>
+        <w:rPr>
+          <w:rStyle w:val="VerbatimChar"/>
+        </w:rPr>
+        <w:t xml:space="preserve">username</w:t>
+      </w:r>
+      <w:r>
+        <w:t xml:space="preserve">/</w:t>
+      </w:r>
+      <w:r>
+        <w:rPr>
+          <w:rStyle w:val="VerbatimChar"/>
+        </w:rPr>
+        <w:t xml:space="preserve">password</w:t>
+      </w:r>
+      <w:r>
+        <w:t xml:space="preserve"> values are matched to the results currently on screen by host and port, and merged into a freshly generated INI.</w:t>
+      </w:r>
+    </w:p>
+    <w:p>
+      <w:pPr>
+        <w:pStyle w:val="Compact"/>
+        <w:numPr>
+          <w:ilvl w:val="0"/>
+          <w:numId w:val="1005"/>
+        </w:numPr>
+      </w:pPr>
+      <w:r>
+        <w:t xml:space="preserve">Entirely client-side: the file you pick, the matching, and the generated download all happen in the browser. No request is sent to the server.</w:t>
+      </w:r>
+    </w:p>
+    <w:p>
+      <w:pPr>
+        <w:pStyle w:val="Compact"/>
+        <w:numPr>
+          <w:ilvl w:val="0"/>
+          <w:numId w:val="1005"/>
+        </w:numPr>
+      </w:pPr>
+      <w:r>
+        <w:t xml:space="preserve">The plain Export INI button, and the HTTP API, are unaffected — they still always return blank credentials.</w:t>
+      </w:r>
+    </w:p>
+    <w:p>
+      <w:pPr>
+        <w:pStyle w:val="Compact"/>
+        <w:numPr>
+          <w:ilvl w:val="0"/>
+          <w:numId w:val="1005"/>
+        </w:numPr>
+      </w:pPr>
+      <w:r>
+        <w:t xml:space="preserve">Only entries that match a host:port in the current results get credentials filled in; everything else in the file you pick is ignored.</w:t>
       </w:r>
     </w:p>
     <w:bookmarkEnd w:id="106"/>
@@ -13684,6 +14120,203 @@
         <w:pict>
           <v:rect style="width:0;height:1.5pt" o:hralign="center" o:hrstd="t" o:hr="t"/>
         </w:pict>
+      </w:r>
+    </w:p>
+    <w:p>
+      <w:pPr>
+        <w:pStyle w:val="Heading3"/>
+      </w:pPr>
+      <w:r>
+        <w:t xml:space="preserve">Workflow G: Iterating on a batch of credentials</w:t>
+      </w:r>
+    </w:p>
+    <w:p>
+      <w:pPr>
+        <w:pStyle w:val="Compact"/>
+        <w:numPr>
+          <w:ilvl w:val="0"/>
+          <w:numId w:val="1005"/>
+        </w:numPr>
+      </w:pPr>
+      <w:r>
+        <w:t xml:space="preserve">Run a scan (Discover, or a Credential Scan with whatever credentials you already have) and open Results.</w:t>
+      </w:r>
+    </w:p>
+    <w:p>
+      <w:pPr>
+        <w:pStyle w:val="Compact"/>
+        <w:numPr>
+          <w:ilvl w:val="0"/>
+          <w:numId w:val="1005"/>
+        </w:numPr>
+      </w:pPr>
+      <w:r>
+        <w:t xml:space="preserve">Click Export INI to get a skeleton with </w:t>
+      </w:r>
+      <w:r>
+        <w:rPr>
+          <w:rStyle w:val="VerbatimChar"/>
+        </w:rPr>
+        <w:t xml:space="preserve">host</w:t>
+      </w:r>
+      <w:r>
+        <w:t xml:space="preserve">, </w:t>
+      </w:r>
+      <w:r>
+        <w:rPr>
+          <w:rStyle w:val="VerbatimChar"/>
+        </w:rPr>
+        <w:t xml:space="preserve">port</w:t>
+      </w:r>
+      <w:r>
+        <w:t xml:space="preserve">, and </w:t>
+      </w:r>
+      <w:r>
+        <w:rPr>
+          <w:rStyle w:val="VerbatimChar"/>
+        </w:rPr>
+        <w:t xml:space="preserve">tls</w:t>
+      </w:r>
+      <w:r>
+        <w:t xml:space="preserve"> filled in, or re-export with </w:t>
+      </w:r>
+      <w:r>
+        <w:rPr>
+          <w:rStyle w:val="VerbatimChar"/>
+        </w:rPr>
+        <w:t xml:space="preserve">INI with credentials</w:t>
+      </w:r>
+      <w:r>
+        <w:t xml:space="preserve"> if you want to keep credentials you already tried.</w:t>
+      </w:r>
+    </w:p>
+    <w:p>
+      <w:pPr>
+        <w:pStyle w:val="Compact"/>
+        <w:numPr>
+          <w:ilvl w:val="0"/>
+          <w:numId w:val="1005"/>
+        </w:numPr>
+      </w:pPr>
+      <w:r>
+        <w:t xml:space="preserve">Fill in </w:t>
+      </w:r>
+      <w:r>
+        <w:rPr>
+          <w:rStyle w:val="VerbatimChar"/>
+        </w:rPr>
+        <w:t xml:space="preserve">username</w:t>
+      </w:r>
+      <w:r>
+        <w:t xml:space="preserve">/</w:t>
+      </w:r>
+      <w:r>
+        <w:rPr>
+          <w:rStyle w:val="VerbatimChar"/>
+        </w:rPr>
+        <w:t xml:space="preserve">password</w:t>
+      </w:r>
+      <w:r>
+        <w:t xml:space="preserve"> for a batch of hosts in a text editor, then run </w:t>
+      </w:r>
+      <w:r>
+        <w:rPr>
+          <w:rStyle w:val="VerbatimChar"/>
+        </w:rPr>
+        <w:t xml:space="preserve">rscan credential-scan -f that-file.ini</w:t>
+      </w:r>
+      <w:r>
+        <w:t xml:space="preserve"> (or upload it on the Credential Scan page).</w:t>
+      </w:r>
+    </w:p>
+    <w:p>
+      <w:pPr>
+        <w:pStyle w:val="Compact"/>
+        <w:numPr>
+          <w:ilvl w:val="0"/>
+          <w:numId w:val="1005"/>
+        </w:numPr>
+      </w:pPr>
+      <w:r>
+        <w:t xml:space="preserve">Review the </w:t>
+      </w:r>
+      <w:r>
+        <w:rPr>
+          <w:rStyle w:val="VerbatimChar"/>
+        </w:rPr>
+        <w:t xml:space="preserve">Auth</w:t>
+      </w:r>
+      <w:r>
+        <w:t xml:space="preserve"> column on Results — </w:t>
+      </w:r>
+      <w:r>
+        <w:rPr>
+          <w:rStyle w:val="VerbatimChar"/>
+        </w:rPr>
+        <w:t xml:space="preserve">authed</w:t>
+      </w:r>
+      <w:r>
+        <w:t xml:space="preserve"> rows are done; </w:t>
+      </w:r>
+      <w:r>
+        <w:rPr>
+          <w:rStyle w:val="VerbatimChar"/>
+        </w:rPr>
+        <w:t xml:space="preserve">wrong pw</w:t>
+      </w:r>
+      <w:r>
+        <w:t xml:space="preserve"> or </w:t>
+      </w:r>
+      <w:r>
+        <w:rPr>
+          <w:rStyle w:val="VerbatimChar"/>
+        </w:rPr>
+        <w:t xml:space="preserve">required</w:t>
+      </w:r>
+      <w:r>
+        <w:t xml:space="preserve"> rows still need attention.</w:t>
+      </w:r>
+    </w:p>
+    <w:p>
+      <w:pPr>
+        <w:pStyle w:val="Compact"/>
+        <w:numPr>
+          <w:ilvl w:val="0"/>
+          <w:numId w:val="1005"/>
+        </w:numPr>
+      </w:pPr>
+      <w:r>
+        <w:t xml:space="preserve">Click </w:t>
+      </w:r>
+      <w:r>
+        <w:rPr>
+          <w:rStyle w:val="VerbatimChar"/>
+        </w:rPr>
+        <w:t xml:space="preserve">INI with credentials</w:t>
+      </w:r>
+      <w:r>
+        <w:t xml:space="preserve">, pick that same file, and you get a fresh INI with the credentials you already entered still there — edit just the rows that failed.</w:t>
+      </w:r>
+    </w:p>
+    <w:p>
+      <w:pPr>
+        <w:pStyle w:val="Compact"/>
+        <w:numPr>
+          <w:ilvl w:val="0"/>
+          <w:numId w:val="1005"/>
+        </w:numPr>
+      </w:pPr>
+      <w:r>
+        <w:t xml:space="preserve">Repeat from step 3 until everything you have credentials for shows </w:t>
+      </w:r>
+      <w:r>
+        <w:rPr>
+          <w:rStyle w:val="VerbatimChar"/>
+        </w:rPr>
+        <w:t xml:space="preserve">authed</w:t>
+      </w:r>
+      <w:r>
+        <w:t xml:space="preserve">.</w:t>
       </w:r>
     </w:p>
     <w:bookmarkEnd w:id="139"/>
@@ -15461,7 +16094,7 @@
       <w:rFonts w:asciiTheme="majorHAnsi" w:cstheme="majorBidi" w:eastAsiaTheme="majorEastAsia" w:hAnsiTheme="majorHAnsi"/>
       <w:b/>
       <w:bCs/>
-      <w:color w:themeColor="accent1" w:themeShade="B5" w:val="345A8A"/>
+      <w:color w:val="DC382C"/>
       <w:sz w:val="36"/>
       <w:szCs w:val="36"/>
     </w:rPr>
@@ -15559,7 +16192,7 @@
       <w:rFonts w:asciiTheme="majorHAnsi" w:cstheme="majorBidi" w:eastAsiaTheme="majorEastAsia" w:hAnsiTheme="majorHAnsi"/>
       <w:b/>
       <w:bCs/>
-      <w:color w:themeColor="accent1" w:val="4F81BD"/>
+      <w:color w:val="DC382C"/>
       <w:sz w:val="32"/>
       <w:szCs w:val="32"/>
     </w:rPr>
@@ -15581,7 +16214,7 @@
       <w:rFonts w:asciiTheme="majorHAnsi" w:cstheme="majorBidi" w:eastAsiaTheme="majorEastAsia" w:hAnsiTheme="majorHAnsi"/>
       <w:b/>
       <w:bCs/>
-      <w:color w:themeColor="accent1" w:val="4F81BD"/>
+      <w:color w:val="DC382C"/>
       <w:sz w:val="28"/>
       <w:szCs w:val="28"/>
     </w:rPr>
@@ -15603,7 +16236,7 @@
       <w:rFonts w:asciiTheme="majorHAnsi" w:cstheme="majorBidi" w:eastAsiaTheme="majorEastAsia" w:hAnsiTheme="majorHAnsi"/>
       <w:b/>
       <w:bCs/>
-      <w:color w:themeColor="accent1" w:val="4F81BD"/>
+      <w:color w:val="DC382C"/>
       <w:sz w:val="24"/>
       <w:szCs w:val="24"/>
     </w:rPr>
@@ -15625,7 +16258,7 @@
       <w:rFonts w:asciiTheme="majorHAnsi" w:cstheme="majorBidi" w:eastAsiaTheme="majorEastAsia" w:hAnsiTheme="majorHAnsi"/>
       <w:bCs/>
       <w:i/>
-      <w:color w:themeColor="accent1" w:val="4F81BD"/>
+      <w:color w:val="DC382C"/>
       <w:sz w:val="24"/>
       <w:szCs w:val="24"/>
     </w:rPr>
@@ -15646,7 +16279,7 @@
     <w:rPr>
       <w:rFonts w:asciiTheme="majorHAnsi" w:cstheme="majorBidi" w:eastAsiaTheme="majorEastAsia" w:hAnsiTheme="majorHAnsi"/>
       <w:iCs/>
-      <w:color w:themeColor="accent1" w:val="4F81BD"/>
+      <w:color w:val="DC382C"/>
       <w:sz w:val="24"/>
       <w:szCs w:val="24"/>
     </w:rPr>
@@ -15666,7 +16299,7 @@
     </w:pPr>
     <w:rPr>
       <w:rFonts w:asciiTheme="majorHAnsi" w:cstheme="majorBidi" w:eastAsiaTheme="majorEastAsia" w:hAnsiTheme="majorHAnsi"/>
-      <w:color w:themeColor="accent1" w:val="4F81BD"/>
+      <w:color w:val="DC382C"/>
       <w:sz w:val="24"/>
       <w:szCs w:val="24"/>
     </w:rPr>
@@ -15784,6 +16417,10 @@
       </w:tblCellMar>
     </w:tblPr>
     <w:tblStylePr w:type="firstRow">
+      <w:rPr>
+        <w:b/>
+        <w:color w:val="DC382C"/>
+      </w:rPr>
       <w:tblPr>
         <w:jc w:val="left"/>
         <w:tblInd w:type="dxa" w:w="0"/>
@@ -15793,8 +16430,9 @@
       </w:trPr>
       <w:tcPr>
         <w:tcBorders>
-          <w:bottom w:val="single"/>
+          <w:bottom w:val="single" w:color="DC382C" w:sz="12"/>
         </w:tcBorders>
+        <w:shd w:val="clear" w:fill="FBEAE8"/>
         <w:vAlign w:val="bottom"/>
       </w:tcPr>
     </w:tblStylePr>

</xml_diff>